<commit_message>
comex, + cdg y update proyecto
</commit_message>
<xml_diff>
--- a/2026/Proyecto_Final/drive_proyecto_final/GRUPO 8 - PROYECTO FINAL/PROYECTO FINAL - CELI.docx
+++ b/2026/Proyecto_Final/drive_proyecto_final/GRUPO 8 - PROYECTO FINAL/PROYECTO FINAL - CELI.docx
@@ -186,12 +186,12 @@
           <wp:inline distB="114300" distT="114300" distL="114300" distR="114300">
             <wp:extent cx="1149836" cy="477060"/>
             <wp:effectExtent b="0" l="0" r="0" t="0"/>
-            <wp:docPr id="4" name="image3.png"/>
+            <wp:docPr id="4" name="image14.png"/>
             <a:graphic>
               <a:graphicData uri="http://schemas.openxmlformats.org/drawingml/2006/picture">
                 <pic:pic>
                   <pic:nvPicPr>
-                    <pic:cNvPr id="0" name="image3.png"/>
+                    <pic:cNvPr id="0" name="image14.png"/>
                     <pic:cNvPicPr preferRelativeResize="0"/>
                   </pic:nvPicPr>
                   <pic:blipFill>
@@ -555,7 +555,7 @@
     </w:p>
     <w:sdt>
       <w:sdtPr>
-        <w:id w:val="515299282"/>
+        <w:id w:val="-435082900"/>
         <w:docPartObj>
           <w:docPartGallery w:val="Table of Contents"/>
           <w:docPartUnique w:val="1"/>
@@ -2578,12 +2578,12 @@
           <wp:inline distB="114300" distT="114300" distL="114300" distR="114300">
             <wp:extent cx="5731200" cy="3225800"/>
             <wp:effectExtent b="0" l="0" r="0" t="0"/>
-            <wp:docPr id="8" name="image4.png"/>
+            <wp:docPr id="8" name="image8.png"/>
             <a:graphic>
               <a:graphicData uri="http://schemas.openxmlformats.org/drawingml/2006/picture">
                 <pic:pic>
                   <pic:nvPicPr>
-                    <pic:cNvPr id="0" name="image4.png"/>
+                    <pic:cNvPr id="0" name="image8.png"/>
                     <pic:cNvPicPr preferRelativeResize="0"/>
                   </pic:nvPicPr>
                   <pic:blipFill>
@@ -2814,12 +2814,12 @@
           <wp:inline distB="114300" distT="114300" distL="114300" distR="114300">
             <wp:extent cx="3271838" cy="2425558"/>
             <wp:effectExtent b="0" l="0" r="0" t="0"/>
-            <wp:docPr id="1" name="image6.png"/>
+            <wp:docPr id="1" name="image5.png"/>
             <a:graphic>
               <a:graphicData uri="http://schemas.openxmlformats.org/drawingml/2006/picture">
                 <pic:pic>
                   <pic:nvPicPr>
-                    <pic:cNvPr id="0" name="image6.png"/>
+                    <pic:cNvPr id="0" name="image5.png"/>
                     <pic:cNvPicPr preferRelativeResize="0"/>
                   </pic:nvPicPr>
                   <pic:blipFill>
@@ -5052,12 +5052,12 @@
           <wp:inline distB="114300" distT="114300" distL="114300" distR="114300">
             <wp:extent cx="5538788" cy="3493838"/>
             <wp:effectExtent b="0" l="0" r="0" t="0"/>
-            <wp:docPr id="5" name="image8.png"/>
+            <wp:docPr id="5" name="image1.png"/>
             <a:graphic>
               <a:graphicData uri="http://schemas.openxmlformats.org/drawingml/2006/picture">
                 <pic:pic>
                   <pic:nvPicPr>
-                    <pic:cNvPr id="0" name="image8.png"/>
+                    <pic:cNvPr id="0" name="image1.png"/>
                     <pic:cNvPicPr preferRelativeResize="0"/>
                   </pic:nvPicPr>
                   <pic:blipFill>
@@ -5104,12 +5104,12 @@
           <wp:inline distB="114300" distT="114300" distL="114300" distR="114300">
             <wp:extent cx="2995613" cy="2789728"/>
             <wp:effectExtent b="0" l="0" r="0" t="0"/>
-            <wp:docPr id="10" name="image2.png"/>
+            <wp:docPr id="10" name="image7.png"/>
             <a:graphic>
               <a:graphicData uri="http://schemas.openxmlformats.org/drawingml/2006/picture">
                 <pic:pic>
                   <pic:nvPicPr>
-                    <pic:cNvPr id="0" name="image2.png"/>
+                    <pic:cNvPr id="0" name="image7.png"/>
                     <pic:cNvPicPr preferRelativeResize="0"/>
                   </pic:nvPicPr>
                   <pic:blipFill>
@@ -5559,12 +5559,12 @@
           <wp:inline distB="114300" distT="114300" distL="114300" distR="114300">
             <wp:extent cx="5731200" cy="2413000"/>
             <wp:effectExtent b="0" l="0" r="0" t="0"/>
-            <wp:docPr descr="Gráfico de respuestas de formularios. Título de la pregunta: Quién consume estos productos en tu hogar?. Número de respuestas: 81 respuestas." id="15" name="image9.png"/>
+            <wp:docPr descr="Gráfico de respuestas de formularios. Título de la pregunta: Quién consume estos productos en tu hogar?. Número de respuestas: 81 respuestas." id="15" name="image6.png"/>
             <a:graphic>
               <a:graphicData uri="http://schemas.openxmlformats.org/drawingml/2006/picture">
                 <pic:pic>
                   <pic:nvPicPr>
-                    <pic:cNvPr descr="Gráfico de respuestas de formularios. Título de la pregunta: Quién consume estos productos en tu hogar?. Número de respuestas: 81 respuestas." id="0" name="image9.png"/>
+                    <pic:cNvPr descr="Gráfico de respuestas de formularios. Título de la pregunta: Quién consume estos productos en tu hogar?. Número de respuestas: 81 respuestas." id="0" name="image6.png"/>
                     <pic:cNvPicPr preferRelativeResize="0"/>
                   </pic:nvPicPr>
                   <pic:blipFill>
@@ -10320,12 +10320,12 @@
           <wp:inline distB="114300" distT="114300" distL="114300" distR="114300">
             <wp:extent cx="5731200" cy="2730500"/>
             <wp:effectExtent b="0" l="0" r="0" t="0"/>
-            <wp:docPr descr="Gráfico de respuestas de formularios. Título de la pregunta: Qué aspecto valoras más en el mercado de galletitas y panificados sin TACC actual?. Número de respuestas: 81 respuestas." id="9" name="image14.png"/>
+            <wp:docPr descr="Gráfico de respuestas de formularios. Título de la pregunta: Qué aspecto valoras más en el mercado de galletitas y panificados sin TACC actual?. Número de respuestas: 81 respuestas." id="9" name="image2.png"/>
             <a:graphic>
               <a:graphicData uri="http://schemas.openxmlformats.org/drawingml/2006/picture">
                 <pic:pic>
                   <pic:nvPicPr>
-                    <pic:cNvPr descr="Gráfico de respuestas de formularios. Título de la pregunta: Qué aspecto valoras más en el mercado de galletitas y panificados sin TACC actual?. Número de respuestas: 81 respuestas." id="0" name="image14.png"/>
+                    <pic:cNvPr descr="Gráfico de respuestas de formularios. Título de la pregunta: Qué aspecto valoras más en el mercado de galletitas y panificados sin TACC actual?. Número de respuestas: 81 respuestas." id="0" name="image2.png"/>
                     <pic:cNvPicPr preferRelativeResize="0"/>
                   </pic:nvPicPr>
                   <pic:blipFill>
@@ -14529,12 +14529,12 @@
           <wp:inline distB="114300" distT="114300" distL="114300" distR="114300">
             <wp:extent cx="6028501" cy="1852613"/>
             <wp:effectExtent b="0" l="0" r="0" t="0"/>
-            <wp:docPr id="11" name="image13.png"/>
+            <wp:docPr id="11" name="image4.png"/>
             <a:graphic>
               <a:graphicData uri="http://schemas.openxmlformats.org/drawingml/2006/picture">
                 <pic:pic>
                   <pic:nvPicPr>
-                    <pic:cNvPr id="0" name="image13.png"/>
+                    <pic:cNvPr id="0" name="image4.png"/>
                     <pic:cNvPicPr preferRelativeResize="0"/>
                   </pic:nvPicPr>
                   <pic:blipFill>
@@ -15078,12 +15078,12 @@
           <wp:inline distB="114300" distT="114300" distL="114300" distR="114300">
             <wp:extent cx="5731200" cy="2806700"/>
             <wp:effectExtent b="0" l="0" r="0" t="0"/>
-            <wp:docPr descr="Gráfico de respuestas de formularios. Título de la pregunta: Cuánto pagarías por estos productos?. Número de respuestas: ." id="3" name="image10.png"/>
+            <wp:docPr descr="Gráfico de respuestas de formularios. Título de la pregunta: Cuánto pagarías por estos productos?. Número de respuestas: ." id="3" name="image3.png"/>
             <a:graphic>
               <a:graphicData uri="http://schemas.openxmlformats.org/drawingml/2006/picture">
                 <pic:pic>
                   <pic:nvPicPr>
-                    <pic:cNvPr descr="Gráfico de respuestas de formularios. Título de la pregunta: Cuánto pagarías por estos productos?. Número de respuestas: ." id="0" name="image10.png"/>
+                    <pic:cNvPr descr="Gráfico de respuestas de formularios. Título de la pregunta: Cuánto pagarías por estos productos?. Número de respuestas: ." id="0" name="image3.png"/>
                     <pic:cNvPicPr preferRelativeResize="0"/>
                   </pic:nvPicPr>
                   <pic:blipFill>
@@ -15794,12 +15794,12 @@
             <wp:extent cx="3176588" cy="2004564"/>
             <wp:effectExtent b="0" l="0" r="0" t="0"/>
             <wp:wrapNone/>
-            <wp:docPr id="2" name="image7.png"/>
+            <wp:docPr id="2" name="image11.png"/>
             <a:graphic>
               <a:graphicData uri="http://schemas.openxmlformats.org/drawingml/2006/picture">
                 <pic:pic>
                   <pic:nvPicPr>
-                    <pic:cNvPr id="0" name="image7.png"/>
+                    <pic:cNvPr id="0" name="image11.png"/>
                     <pic:cNvPicPr preferRelativeResize="0"/>
                   </pic:nvPicPr>
                   <pic:blipFill>
@@ -16359,12 +16359,12 @@
             <wp:extent cx="7291388" cy="2577466"/>
             <wp:effectExtent b="0" l="0" r="0" t="0"/>
             <wp:wrapSquare wrapText="bothSides" distB="114300" distT="114300" distL="114300" distR="114300"/>
-            <wp:docPr id="13" name="image11.png"/>
+            <wp:docPr id="13" name="image9.png"/>
             <a:graphic>
               <a:graphicData uri="http://schemas.openxmlformats.org/drawingml/2006/picture">
                 <pic:pic>
                   <pic:nvPicPr>
-                    <pic:cNvPr id="0" name="image11.png"/>
+                    <pic:cNvPr id="0" name="image9.png"/>
                     <pic:cNvPicPr preferRelativeResize="0"/>
                   </pic:nvPicPr>
                   <pic:blipFill>
@@ -29750,12 +29750,12 @@
           <wp:inline distB="114300" distT="114300" distL="114300" distR="114300">
             <wp:extent cx="5731200" cy="3543300"/>
             <wp:effectExtent b="0" l="0" r="0" t="0"/>
-            <wp:docPr descr="Gráfico" id="6" name="image1.png"/>
+            <wp:docPr descr="Gráfico" id="6" name="image10.png"/>
             <a:graphic>
               <a:graphicData uri="http://schemas.openxmlformats.org/drawingml/2006/picture">
                 <pic:pic>
                   <pic:nvPicPr>
-                    <pic:cNvPr descr="Gráfico" id="0" name="image1.png"/>
+                    <pic:cNvPr descr="Gráfico" id="0" name="image10.png"/>
                     <pic:cNvPicPr preferRelativeResize="0"/>
                   </pic:nvPicPr>
                   <pic:blipFill>
@@ -40109,12 +40109,12 @@
           <wp:extent cx="1290638" cy="476796"/>
           <wp:effectExtent b="0" l="0" r="0" t="0"/>
           <wp:wrapNone/>
-          <wp:docPr id="16" name="image5.png"/>
+          <wp:docPr id="16" name="image13.png"/>
           <a:graphic>
             <a:graphicData uri="http://schemas.openxmlformats.org/drawingml/2006/picture">
               <pic:pic>
                 <pic:nvPicPr>
-                  <pic:cNvPr id="0" name="image5.png"/>
+                  <pic:cNvPr id="0" name="image13.png"/>
                   <pic:cNvPicPr preferRelativeResize="0"/>
                 </pic:nvPicPr>
                 <pic:blipFill>
@@ -40153,12 +40153,12 @@
           <wp:extent cx="1290638" cy="476796"/>
           <wp:effectExtent b="0" l="0" r="0" t="0"/>
           <wp:wrapNone/>
-          <wp:docPr id="12" name="image5.png"/>
+          <wp:docPr id="12" name="image13.png"/>
           <a:graphic>
             <a:graphicData uri="http://schemas.openxmlformats.org/drawingml/2006/picture">
               <pic:pic>
                 <pic:nvPicPr>
-                  <pic:cNvPr id="0" name="image5.png"/>
+                  <pic:cNvPr id="0" name="image13.png"/>
                   <pic:cNvPicPr preferRelativeResize="0"/>
                 </pic:nvPicPr>
                 <pic:blipFill>

</xml_diff>